<commit_message>
Salva memoria da IA e atualizacoes nos documentos do artigo
</commit_message>
<xml_diff>
--- a/Documentos Artigo/Artigo_Completo_Citado.docx
+++ b/Documentos Artigo/Artigo_Completo_Citado.docx
@@ -52,7 +52,21 @@
         <w:rPr>
           <w:lang w:val="pt-BR"/>
         </w:rPr>
-        <w:t>A relevância da análise aprofundada dos microdados permite uma investigação granular em duas frentes: o desempenho cognitivo e a percepção discente. No campo do desempenho, Sathler (2023) demonstra que a desagregação dos resultados em níveis de acertos e erros por questão é crucial para identificar temas de maior dificuldade e ajustar estratégias pedagógicas de forma direcionada. Essa perspectiva é reforçada por Cunha, Sales e Santos (2021), que propõem o uso de técnicas de análise automática de dados para extrair informações relevantes e monitorar a evolução das competências previstas nas Diretrizes Curriculares Nacionais (DCNs).</w:t>
+        <w:t>A relevância da análise aprofundada dos microdados permite uma investigação granular em duas frentes: o desempenho cognitivo e a percepção discente. No campo do desempenho, Sathler (2023) demonstra que a desagregação dos resultados em níveis de acertos e erros por questão é crucial para identificar temas de maior dificuldade e ajustar estratégias pedagógicas de forma direcionada. Essa perspectiva é reforçada por Cunha, Sales e Santos (2021), que propõem o uso de técnicas de análise automática de dados para extrair informações relevantes e monitorar a evolução das competências previstas nas Diretrizes Curriculares Nacionais (</w:t>
+      </w:r>
+      <w:proofErr w:type="spellStart"/>
+      <w:r>
+        <w:rPr>
+          <w:lang w:val="pt-BR"/>
+        </w:rPr>
+        <w:t>DCNs</w:t>
+      </w:r>
+      <w:proofErr w:type="spellEnd"/>
+      <w:r>
+        <w:rPr>
+          <w:lang w:val="pt-BR"/>
+        </w:rPr>
+        <w:t>).</w:t>
       </w:r>
     </w:p>
     <w:p>
@@ -78,7 +92,35 @@
         <w:rPr>
           <w:lang w:val="pt-BR"/>
         </w:rPr>
-        <w:t>Apesar da riqueza informativa, a transição de relatórios estáticos para modelos de análise dinâmica ainda representa um desafio técnico nas Instituições Federais. Conforme discutido por Barreto e Freitas (2020), o uso de ferramentas de Business Intelligence (BI) surge como uma solução estratégica para a consolidação de dados e a visualização intuitiva de indicadores que auxiliam na gestão acadêmica. De fato, iniciativas recentes propõem ferramentas dedicadas a essa visualização, como o Enade.Vis, voltado a facilitar a análise dos dados do exame (OTSUBO, 2024), e plataformas de mineração de dados com foco no perfil discente da computação (ALVES; MATOS; CANEDO, 2019). Tais sistemas fortalecem a premissa de que a consolidação de dados e a criação de painéis baseados no Enade ajudam a suprir a carência de plataformas analíticas nas instituições (CRUZ; MACIEL, 2023).</w:t>
+        <w:t xml:space="preserve">Apesar da riqueza informativa, a transição de relatórios estáticos para modelos de análise dinâmica ainda representa um desafio técnico nas Instituições Federais. Conforme discutido por Barreto e Freitas (2020), o uso de ferramentas de Business </w:t>
+      </w:r>
+      <w:proofErr w:type="spellStart"/>
+      <w:r>
+        <w:rPr>
+          <w:lang w:val="pt-BR"/>
+        </w:rPr>
+        <w:t>Intelligence</w:t>
+      </w:r>
+      <w:proofErr w:type="spellEnd"/>
+      <w:r>
+        <w:rPr>
+          <w:lang w:val="pt-BR"/>
+        </w:rPr>
+        <w:t xml:space="preserve"> (BI) surge como uma solução estratégica para a consolidação de dados e a visualização intuitiva de indicadores que auxiliam na gestão acadêmica. De fato, iniciativas recentes propõem ferramentas dedicadas a essa visualização, como o </w:t>
+      </w:r>
+      <w:proofErr w:type="spellStart"/>
+      <w:r>
+        <w:rPr>
+          <w:lang w:val="pt-BR"/>
+        </w:rPr>
+        <w:t>Enade.Vis</w:t>
+      </w:r>
+      <w:proofErr w:type="spellEnd"/>
+      <w:r>
+        <w:rPr>
+          <w:lang w:val="pt-BR"/>
+        </w:rPr>
+        <w:t>, voltado a facilitar a análise dos dados do exame (OTSUBO, 2024), e plataformas de mineração de dados com foco no perfil discente da computação (ALVES; MATOS; CANEDO, 2019). Tais sistemas fortalecem a premissa de que a consolidação de dados e a criação de painéis baseados no Enade ajudam a suprir a carência de plataformas analíticas nas instituições (CRUZ; MACIEL, 2023).</w:t>
       </w:r>
     </w:p>
     <w:p>
@@ -91,14 +133,46 @@
         <w:rPr>
           <w:lang w:val="pt-BR"/>
         </w:rPr>
-        <w:t xml:space="preserve">Nesse contexto, este trabalho apresenta o desenvolvimento de um dashboard voltado para os cursos do Instituto Federal do Espírito Santo (Ifes), abrangendo o ciclo de 2017 a 2025. O objetivo é ter um ambiente de visualização de dados para auxiliar as avaliações dos cursos </w:t>
+        <w:t xml:space="preserve">Nesse contexto, este trabalho apresenta o desenvolvimento de um dashboard voltado para os cursos do Instituto Federal do Espírito Santo (Ifes), abrangendo o ciclo </w:t>
       </w:r>
       <w:r>
         <w:rPr>
           <w:lang w:val="pt-BR"/>
         </w:rPr>
+        <w:t>iniciado em 2017</w:t>
+      </w:r>
+      <w:r>
+        <w:rPr>
+          <w:lang w:val="pt-BR"/>
+        </w:rPr>
+        <w:t>. O objetivo é ter um ambiente de visualização de dados para auxiliar as avaliações dos cursos</w:t>
+      </w:r>
+      <w:r>
+        <w:rPr>
+          <w:lang w:val="pt-BR"/>
+        </w:rPr>
+        <w:t xml:space="preserve"> </w:t>
+      </w:r>
+      <w:r>
+        <w:rPr>
+          <w:lang w:val="pt-BR"/>
+        </w:rPr>
         <w:lastRenderedPageBreak/>
-        <w:t>como por exemplo, ter o levantamento de acertos e erros de cada questão e identificar nos questionários quais foram os piores avaliados. Sendo uma ferramenta de suporte à decisão que contribua para melhorar os cursos e uma melhor formação dos alunos nos cursos e transformando dados brutos em planos de ação institucionais.</w:t>
+        <w:t xml:space="preserve">como por exemplo, ter o levantamento de acertos e erros de cada questão e identificar nos questionários quais foram os </w:t>
+      </w:r>
+      <w:proofErr w:type="gramStart"/>
+      <w:r>
+        <w:rPr>
+          <w:lang w:val="pt-BR"/>
+        </w:rPr>
+        <w:t>piores</w:t>
+      </w:r>
+      <w:proofErr w:type="gramEnd"/>
+      <w:r>
+        <w:rPr>
+          <w:lang w:val="pt-BR"/>
+        </w:rPr>
+        <w:t xml:space="preserve"> avaliados. Sendo uma ferramenta de suporte à decisão que contribua para melhorar os cursos e uma melhor formação dos alunos nos cursos e transformando dados brutos em planos de ação institucionais.</w:t>
       </w:r>
     </w:p>
     <w:p>
@@ -271,7 +345,21 @@
         <w:rPr>
           <w:lang w:val="pt-BR"/>
         </w:rPr>
-        <w:t>A identificação dos questionários pior avaliados é fundamental, pois, deficiências na infraestrutura ou na organização pedagógica podem atuar como variáveis intervenientes que prejudicam a vivência e o desempenho final dos alunos (LIMA, 2018; RODRIGUES, 2024).</w:t>
+        <w:t xml:space="preserve">A identificação </w:t>
+      </w:r>
+      <w:proofErr w:type="gramStart"/>
+      <w:r>
+        <w:rPr>
+          <w:lang w:val="pt-BR"/>
+        </w:rPr>
+        <w:t>dos questionários pior</w:t>
+      </w:r>
+      <w:proofErr w:type="gramEnd"/>
+      <w:r>
+        <w:rPr>
+          <w:lang w:val="pt-BR"/>
+        </w:rPr>
+        <w:t xml:space="preserve"> avaliados é fundamental, pois, deficiências na infraestrutura ou na organização pedagógica podem atuar como variáveis intervenientes que prejudicam a vivência e o desempenho final dos alunos (LIMA, 2018; RODRIGUES, 2024).</w:t>
       </w:r>
     </w:p>
     <w:p>
@@ -298,7 +386,21 @@
         <w:rPr>
           <w:lang w:val="pt-BR"/>
         </w:rPr>
-        <w:t>A metodologia deste trabalho consiste no desenvolvimento de um dashboard analítico voltado aos cursos do Instituto Federal do Espírito Santo (Ifes), utilizando a linguagem Python e a biblioteca de visualização interativa Streamlit. O processo envolveu a coleta, o tratamento e a visualização de grandes volumes de microdados públicos disponibilizados pelo Inep (INEP, 2024).</w:t>
+        <w:t xml:space="preserve">A metodologia deste trabalho consiste no desenvolvimento de um dashboard analítico voltado aos cursos do Instituto Federal do Espírito Santo (Ifes), utilizando a linguagem Python e a biblioteca de visualização interativa </w:t>
+      </w:r>
+      <w:proofErr w:type="spellStart"/>
+      <w:r>
+        <w:rPr>
+          <w:lang w:val="pt-BR"/>
+        </w:rPr>
+        <w:t>Streamlit</w:t>
+      </w:r>
+      <w:proofErr w:type="spellEnd"/>
+      <w:r>
+        <w:rPr>
+          <w:lang w:val="pt-BR"/>
+        </w:rPr>
+        <w:t>. O processo envolveu a coleta, o tratamento e a visualização de grandes volumes de microdados públicos disponibilizados pelo Inep (INEP, 2024).</w:t>
       </w:r>
     </w:p>
     <w:p>
@@ -338,7 +440,21 @@
         <w:rPr>
           <w:lang w:val="pt-BR"/>
         </w:rPr>
-        <w:t>Adicionalmente, foi executado um refinamento semântico. Tabelas oficiais do sistema e-MEC foram cruzadas com a base extraída para corrigir nomenclaturas genéricas ou ausentes e associar os alunos corretamente aos seus campi, garantindo a fidelidade e a integridade da base de dados analítica, o que corrobora com a necessidade de extração e tratamento rigoroso de microdados abordada por Cunha, Sales e Santos (2021).</w:t>
+        <w:t xml:space="preserve">Adicionalmente, foi executado um refinamento semântico. Tabelas oficiais do sistema </w:t>
+      </w:r>
+      <w:proofErr w:type="spellStart"/>
+      <w:r>
+        <w:rPr>
+          <w:lang w:val="pt-BR"/>
+        </w:rPr>
+        <w:t>e-MEC</w:t>
+      </w:r>
+      <w:proofErr w:type="spellEnd"/>
+      <w:r>
+        <w:rPr>
+          <w:lang w:val="pt-BR"/>
+        </w:rPr>
+        <w:t xml:space="preserve"> foram cruzadas com a base extraída para corrigir nomenclaturas genéricas ou ausentes e associar os alunos corretamente aos seus campi, garantindo a fidelidade e a integridade da base de dados analítica, o que corrobora com a necessidade de extração e tratamento rigoroso de microdados abordada por Cunha, Sales e Santos (2021).</w:t>
       </w:r>
     </w:p>
     <w:p>
@@ -365,14 +481,56 @@
         <w:rPr>
           <w:lang w:val="pt-BR"/>
         </w:rPr>
-        <w:t xml:space="preserve">O dashboard foi projetado em uma arquitetura multipáginas gerenciadas via estados de sessão, o que confere ao aplicativo uma navegação fluida. A identidade visual foi estilizada em *Glassmorphism* (efeitos de translucidez) no CSS, alinhada à paleta de cores institucional, resultando em uma plataforma que se equipara a ferramentas corporativas de </w:t>
+        <w:t xml:space="preserve">O dashboard foi projetado em uma arquitetura </w:t>
+      </w:r>
+      <w:proofErr w:type="spellStart"/>
+      <w:r>
+        <w:rPr>
+          <w:lang w:val="pt-BR"/>
+        </w:rPr>
+        <w:t>multipáginas</w:t>
+      </w:r>
+      <w:proofErr w:type="spellEnd"/>
+      <w:r>
+        <w:rPr>
+          <w:lang w:val="pt-BR"/>
+        </w:rPr>
+        <w:t xml:space="preserve"> gerenciadas via estados de sessão, o que confere ao aplicativo uma navegação fluida. A identidade visual foi estilizada em *</w:t>
+      </w:r>
+      <w:proofErr w:type="spellStart"/>
+      <w:r>
+        <w:rPr>
+          <w:lang w:val="pt-BR"/>
+        </w:rPr>
+        <w:t>Glassmorphism</w:t>
+      </w:r>
+      <w:proofErr w:type="spellEnd"/>
+      <w:r>
+        <w:rPr>
+          <w:lang w:val="pt-BR"/>
+        </w:rPr>
+        <w:t xml:space="preserve">* (efeitos de translucidez) no CSS, alinhada à paleta de cores institucional, resultando em uma plataforma que se equipara a ferramentas corporativas de </w:t>
       </w:r>
       <w:r>
         <w:rPr>
           <w:lang w:val="pt-BR"/>
         </w:rPr>
         <w:lastRenderedPageBreak/>
-        <w:t>Business Intelligence aplicadas à gestão educacional, conforme proposto por Barreto e Freitas (2020).</w:t>
+        <w:t xml:space="preserve">Business </w:t>
+      </w:r>
+      <w:proofErr w:type="spellStart"/>
+      <w:r>
+        <w:rPr>
+          <w:lang w:val="pt-BR"/>
+        </w:rPr>
+        <w:t>Intelligence</w:t>
+      </w:r>
+      <w:proofErr w:type="spellEnd"/>
+      <w:r>
+        <w:rPr>
+          <w:lang w:val="pt-BR"/>
+        </w:rPr>
+        <w:t xml:space="preserve"> aplicadas à gestão educacional, conforme proposto por Barreto e Freitas (2020).</w:t>
       </w:r>
     </w:p>
     <w:p>
@@ -417,6 +575,109 @@
     </w:p>
     <w:p>
       <w:pPr>
+        <w:rPr>
+          <w:lang w:val="pt-BR"/>
+        </w:rPr>
+      </w:pPr>
+      <w:r>
+        <w:rPr>
+          <w:noProof/>
+          <w:lang w:val="pt-BR"/>
+        </w:rPr>
+        <w:drawing>
+          <wp:inline distT="0" distB="0" distL="0" distR="0" wp14:anchorId="18B3EB11" wp14:editId="3C1B6FC2">
+            <wp:extent cx="5486400" cy="3084830"/>
+            <wp:effectExtent l="0" t="0" r="0" b="1270"/>
+            <wp:docPr id="171561759" name="Imagem 3"/>
+            <wp:cNvGraphicFramePr>
+              <a:graphicFrameLocks xmlns:a="http://schemas.openxmlformats.org/drawingml/2006/main" noChangeAspect="1"/>
+            </wp:cNvGraphicFramePr>
+            <a:graphic xmlns:a="http://schemas.openxmlformats.org/drawingml/2006/main">
+              <a:graphicData uri="http://schemas.openxmlformats.org/drawingml/2006/picture">
+                <pic:pic xmlns:pic="http://schemas.openxmlformats.org/drawingml/2006/picture">
+                  <pic:nvPicPr>
+                    <pic:cNvPr id="171561759" name="Imagem 171561759"/>
+                    <pic:cNvPicPr/>
+                  </pic:nvPicPr>
+                  <pic:blipFill>
+                    <a:blip r:embed="rId6"/>
+                    <a:stretch>
+                      <a:fillRect/>
+                    </a:stretch>
+                  </pic:blipFill>
+                  <pic:spPr>
+                    <a:xfrm>
+                      <a:off x="0" y="0"/>
+                      <a:ext cx="5486400" cy="3084830"/>
+                    </a:xfrm>
+                    <a:prstGeom prst="rect">
+                      <a:avLst/>
+                    </a:prstGeom>
+                  </pic:spPr>
+                </pic:pic>
+              </a:graphicData>
+            </a:graphic>
+          </wp:inline>
+        </w:drawing>
+      </w:r>
+    </w:p>
+    <w:p>
+      <w:pPr>
+        <w:rPr>
+          <w:lang w:val="pt-BR"/>
+        </w:rPr>
+      </w:pPr>
+      <w:r>
+        <w:rPr>
+          <w:noProof/>
+          <w:lang w:val="pt-BR"/>
+        </w:rPr>
+        <w:drawing>
+          <wp:inline distT="0" distB="0" distL="0" distR="0" wp14:anchorId="2F18C8F7" wp14:editId="0430FC82">
+            <wp:extent cx="5486400" cy="1920875"/>
+            <wp:effectExtent l="0" t="0" r="0" b="3175"/>
+            <wp:docPr id="854134217" name="Imagem 13"/>
+            <wp:cNvGraphicFramePr>
+              <a:graphicFrameLocks xmlns:a="http://schemas.openxmlformats.org/drawingml/2006/main" noChangeAspect="1"/>
+            </wp:cNvGraphicFramePr>
+            <a:graphic xmlns:a="http://schemas.openxmlformats.org/drawingml/2006/main">
+              <a:graphicData uri="http://schemas.openxmlformats.org/drawingml/2006/picture">
+                <pic:pic xmlns:pic="http://schemas.openxmlformats.org/drawingml/2006/picture">
+                  <pic:nvPicPr>
+                    <pic:cNvPr id="854134217" name="Imagem 854134217"/>
+                    <pic:cNvPicPr/>
+                  </pic:nvPicPr>
+                  <pic:blipFill>
+                    <a:blip r:embed="rId7"/>
+                    <a:stretch>
+                      <a:fillRect/>
+                    </a:stretch>
+                  </pic:blipFill>
+                  <pic:spPr>
+                    <a:xfrm>
+                      <a:off x="0" y="0"/>
+                      <a:ext cx="5486400" cy="1920875"/>
+                    </a:xfrm>
+                    <a:prstGeom prst="rect">
+                      <a:avLst/>
+                    </a:prstGeom>
+                  </pic:spPr>
+                </pic:pic>
+              </a:graphicData>
+            </a:graphic>
+          </wp:inline>
+        </w:drawing>
+      </w:r>
+    </w:p>
+    <w:p>
+      <w:pPr>
+        <w:rPr>
+          <w:lang w:val="pt-BR"/>
+        </w:rPr>
+      </w:pPr>
+    </w:p>
+    <w:p>
+      <w:pPr>
         <w:pStyle w:val="Ttulo2"/>
         <w:rPr>
           <w:lang w:val="pt-BR"/>
@@ -426,6 +687,7 @@
         <w:rPr>
           <w:lang w:val="pt-BR"/>
         </w:rPr>
+        <w:lastRenderedPageBreak/>
         <w:t>4.1 Painel de Cursos e Desempenho</w:t>
       </w:r>
     </w:p>
@@ -437,6 +699,54 @@
       </w:pPr>
       <w:r>
         <w:rPr>
+          <w:noProof/>
+          <w:lang w:val="pt-BR"/>
+        </w:rPr>
+        <w:drawing>
+          <wp:inline distT="0" distB="0" distL="0" distR="0" wp14:anchorId="34ACA2F4" wp14:editId="5C70C361">
+            <wp:extent cx="5486400" cy="2121535"/>
+            <wp:effectExtent l="0" t="0" r="0" b="0"/>
+            <wp:docPr id="243323924" name="Imagem 5"/>
+            <wp:cNvGraphicFramePr>
+              <a:graphicFrameLocks xmlns:a="http://schemas.openxmlformats.org/drawingml/2006/main" noChangeAspect="1"/>
+            </wp:cNvGraphicFramePr>
+            <a:graphic xmlns:a="http://schemas.openxmlformats.org/drawingml/2006/main">
+              <a:graphicData uri="http://schemas.openxmlformats.org/drawingml/2006/picture">
+                <pic:pic xmlns:pic="http://schemas.openxmlformats.org/drawingml/2006/picture">
+                  <pic:nvPicPr>
+                    <pic:cNvPr id="243323924" name="Imagem 243323924"/>
+                    <pic:cNvPicPr/>
+                  </pic:nvPicPr>
+                  <pic:blipFill>
+                    <a:blip r:embed="rId8"/>
+                    <a:stretch>
+                      <a:fillRect/>
+                    </a:stretch>
+                  </pic:blipFill>
+                  <pic:spPr>
+                    <a:xfrm>
+                      <a:off x="0" y="0"/>
+                      <a:ext cx="5486400" cy="2121535"/>
+                    </a:xfrm>
+                    <a:prstGeom prst="rect">
+                      <a:avLst/>
+                    </a:prstGeom>
+                  </pic:spPr>
+                </pic:pic>
+              </a:graphicData>
+            </a:graphic>
+          </wp:inline>
+        </w:drawing>
+      </w:r>
+    </w:p>
+    <w:p>
+      <w:pPr>
+        <w:rPr>
+          <w:lang w:val="pt-BR"/>
+        </w:rPr>
+      </w:pPr>
+      <w:r>
+        <w:rPr>
           <w:lang w:val="pt-BR"/>
         </w:rPr>
         <w:t>O sistema evidencia o balanço de proficiência das turmas ao extrair e plotar graficamente as notas brutas das frações de Formação Geral (FG) e Componente Específico (CE). Destaca-se a implementação de um cálculo dos alunos que não fizeram a prova (abstenção) (razão entre o número de inscritos e os que efetivamente realizaram a prova). Este indicador, exposto através de gráficos de barras em tons de alerta, permite que as coordenações monitorem os índices de ausência de forma tempestiva.</w:t>
@@ -444,6 +754,54 @@
     </w:p>
     <w:p>
       <w:pPr>
+        <w:rPr>
+          <w:lang w:val="pt-BR"/>
+        </w:rPr>
+      </w:pPr>
+      <w:r>
+        <w:rPr>
+          <w:noProof/>
+          <w:lang w:val="pt-BR"/>
+        </w:rPr>
+        <w:drawing>
+          <wp:inline distT="0" distB="0" distL="0" distR="0" wp14:anchorId="5A938D05" wp14:editId="4542FCA0">
+            <wp:extent cx="5486400" cy="2473960"/>
+            <wp:effectExtent l="0" t="0" r="0" b="2540"/>
+            <wp:docPr id="824121238" name="Imagem 7"/>
+            <wp:cNvGraphicFramePr>
+              <a:graphicFrameLocks xmlns:a="http://schemas.openxmlformats.org/drawingml/2006/main" noChangeAspect="1"/>
+            </wp:cNvGraphicFramePr>
+            <a:graphic xmlns:a="http://schemas.openxmlformats.org/drawingml/2006/main">
+              <a:graphicData uri="http://schemas.openxmlformats.org/drawingml/2006/picture">
+                <pic:pic xmlns:pic="http://schemas.openxmlformats.org/drawingml/2006/picture">
+                  <pic:nvPicPr>
+                    <pic:cNvPr id="824121238" name="Imagem 824121238"/>
+                    <pic:cNvPicPr/>
+                  </pic:nvPicPr>
+                  <pic:blipFill>
+                    <a:blip r:embed="rId9"/>
+                    <a:stretch>
+                      <a:fillRect/>
+                    </a:stretch>
+                  </pic:blipFill>
+                  <pic:spPr>
+                    <a:xfrm>
+                      <a:off x="0" y="0"/>
+                      <a:ext cx="5486400" cy="2473960"/>
+                    </a:xfrm>
+                    <a:prstGeom prst="rect">
+                      <a:avLst/>
+                    </a:prstGeom>
+                  </pic:spPr>
+                </pic:pic>
+              </a:graphicData>
+            </a:graphic>
+          </wp:inline>
+        </w:drawing>
+      </w:r>
+    </w:p>
+    <w:p>
+      <w:pPr>
         <w:pStyle w:val="Ttulo2"/>
         <w:rPr>
           <w:lang w:val="pt-BR"/>
@@ -453,6 +811,7 @@
         <w:rPr>
           <w:lang w:val="pt-BR"/>
         </w:rPr>
+        <w:lastRenderedPageBreak/>
         <w:t>4.2 Análise do Componente Específico (CE)</w:t>
       </w:r>
     </w:p>
@@ -464,9 +823,131 @@
       </w:pPr>
       <w:r>
         <w:rPr>
-          <w:lang w:val="pt-BR"/>
-        </w:rPr>
-        <w:t>Com o intuito de viabilizar uma investigação cirúrgica no conhecimento técnico dos estudantes, o painel integra uma aba dedicada à análise de cada questão do Componente Específico (CE1 ao CE27). Gráficos interativos exibem os índices percentuais de acerto frente às margens de erro, bem como a contabilização de alternativas assinaladas incorretamente, questões em branco ou anuladas. Mapas de calor (Heatmaps) facilitam a identificação visual imediata dos pontos fracos de uma turma em tópicos curriculares, possibilitando a intervenção cirúrgica na grade e nos projetos pedagógicos dos cursos. Este nível de detalhamento é fundamental para monitorar a evolução das competências discentes (CUNHA; SALES; SANTOS, 2021; SATHLER, 2023).</w:t>
+          <w:noProof/>
+          <w:lang w:val="pt-BR"/>
+        </w:rPr>
+        <w:drawing>
+          <wp:inline distT="0" distB="0" distL="0" distR="0" wp14:anchorId="4DBC914F" wp14:editId="00700C65">
+            <wp:extent cx="5486400" cy="1950720"/>
+            <wp:effectExtent l="0" t="0" r="0" b="0"/>
+            <wp:docPr id="1074176530" name="Imagem 8"/>
+            <wp:cNvGraphicFramePr>
+              <a:graphicFrameLocks xmlns:a="http://schemas.openxmlformats.org/drawingml/2006/main" noChangeAspect="1"/>
+            </wp:cNvGraphicFramePr>
+            <a:graphic xmlns:a="http://schemas.openxmlformats.org/drawingml/2006/main">
+              <a:graphicData uri="http://schemas.openxmlformats.org/drawingml/2006/picture">
+                <pic:pic xmlns:pic="http://schemas.openxmlformats.org/drawingml/2006/picture">
+                  <pic:nvPicPr>
+                    <pic:cNvPr id="1074176530" name="Imagem 1074176530"/>
+                    <pic:cNvPicPr/>
+                  </pic:nvPicPr>
+                  <pic:blipFill>
+                    <a:blip r:embed="rId10"/>
+                    <a:stretch>
+                      <a:fillRect/>
+                    </a:stretch>
+                  </pic:blipFill>
+                  <pic:spPr>
+                    <a:xfrm>
+                      <a:off x="0" y="0"/>
+                      <a:ext cx="5486400" cy="1950720"/>
+                    </a:xfrm>
+                    <a:prstGeom prst="rect">
+                      <a:avLst/>
+                    </a:prstGeom>
+                  </pic:spPr>
+                </pic:pic>
+              </a:graphicData>
+            </a:graphic>
+          </wp:inline>
+        </w:drawing>
+      </w:r>
+    </w:p>
+    <w:p>
+      <w:pPr>
+        <w:rPr>
+          <w:lang w:val="pt-BR"/>
+        </w:rPr>
+      </w:pPr>
+      <w:r>
+        <w:rPr>
+          <w:noProof/>
+          <w:lang w:val="pt-BR"/>
+        </w:rPr>
+        <w:drawing>
+          <wp:inline distT="0" distB="0" distL="0" distR="0" wp14:anchorId="667B32BB" wp14:editId="11F12619">
+            <wp:extent cx="5486400" cy="2803525"/>
+            <wp:effectExtent l="0" t="0" r="0" b="0"/>
+            <wp:docPr id="2134318131" name="Imagem 9"/>
+            <wp:cNvGraphicFramePr>
+              <a:graphicFrameLocks xmlns:a="http://schemas.openxmlformats.org/drawingml/2006/main" noChangeAspect="1"/>
+            </wp:cNvGraphicFramePr>
+            <a:graphic xmlns:a="http://schemas.openxmlformats.org/drawingml/2006/main">
+              <a:graphicData uri="http://schemas.openxmlformats.org/drawingml/2006/picture">
+                <pic:pic xmlns:pic="http://schemas.openxmlformats.org/drawingml/2006/picture">
+                  <pic:nvPicPr>
+                    <pic:cNvPr id="2134318131" name="Imagem 2134318131"/>
+                    <pic:cNvPicPr/>
+                  </pic:nvPicPr>
+                  <pic:blipFill>
+                    <a:blip r:embed="rId11"/>
+                    <a:stretch>
+                      <a:fillRect/>
+                    </a:stretch>
+                  </pic:blipFill>
+                  <pic:spPr>
+                    <a:xfrm>
+                      <a:off x="0" y="0"/>
+                      <a:ext cx="5486400" cy="2803525"/>
+                    </a:xfrm>
+                    <a:prstGeom prst="rect">
+                      <a:avLst/>
+                    </a:prstGeom>
+                  </pic:spPr>
+                </pic:pic>
+              </a:graphicData>
+            </a:graphic>
+          </wp:inline>
+        </w:drawing>
+      </w:r>
+    </w:p>
+    <w:p>
+      <w:pPr>
+        <w:rPr>
+          <w:lang w:val="pt-BR"/>
+        </w:rPr>
+      </w:pPr>
+      <w:r>
+        <w:rPr>
+          <w:lang w:val="pt-BR"/>
+        </w:rPr>
+        <w:t>Com o intuito de viabilizar uma investigação cirúrgica no conhecimento técnico dos estudantes, o painel integra uma aba dedicada à análise de cada questão do Componente</w:t>
+      </w:r>
+      <w:r>
+        <w:rPr>
+          <w:lang w:val="pt-BR"/>
+        </w:rPr>
+        <w:t xml:space="preserve"> </w:t>
+      </w:r>
+      <w:r>
+        <w:rPr>
+          <w:lang w:val="pt-BR"/>
+        </w:rPr>
+        <w:t>Específico (CE1 ao CE27). Gráficos interativos exibem os índices percentuais de acerto frente às margens de erro, bem como a contabilização de alternativas assinaladas incorretamente, questões em branco ou anuladas. Mapas de calor (</w:t>
+      </w:r>
+      <w:proofErr w:type="spellStart"/>
+      <w:r>
+        <w:rPr>
+          <w:lang w:val="pt-BR"/>
+        </w:rPr>
+        <w:t>Heatmaps</w:t>
+      </w:r>
+      <w:proofErr w:type="spellEnd"/>
+      <w:r>
+        <w:rPr>
+          <w:lang w:val="pt-BR"/>
+        </w:rPr>
+        <w:t>) facilitam a identificação visual imediata dos pontos fracos de uma turma em tópicos curriculares, possibilitando a intervenção cirúrgica na grade e nos projetos pedagógicos dos cursos. Este nível de detalhamento é fundamental para monitorar a evolução das competências discentes (CUNHA; SALES; SANTOS, 2021; SATHLER, 2023).</w:t>
       </w:r>
     </w:p>
     <w:p>
@@ -499,6 +980,55 @@
     <w:p>
       <w:pPr>
         <w:rPr>
+          <w:lang w:val="pt-BR"/>
+        </w:rPr>
+      </w:pPr>
+      <w:r>
+        <w:rPr>
+          <w:noProof/>
+          <w:lang w:val="pt-BR"/>
+        </w:rPr>
+        <w:lastRenderedPageBreak/>
+        <w:drawing>
+          <wp:inline distT="0" distB="0" distL="0" distR="0" wp14:anchorId="49F129A9" wp14:editId="56A43DB9">
+            <wp:extent cx="5486400" cy="3086100"/>
+            <wp:effectExtent l="0" t="0" r="0" b="0"/>
+            <wp:docPr id="50673541" name="Imagem 10"/>
+            <wp:cNvGraphicFramePr>
+              <a:graphicFrameLocks xmlns:a="http://schemas.openxmlformats.org/drawingml/2006/main" noChangeAspect="1"/>
+            </wp:cNvGraphicFramePr>
+            <a:graphic xmlns:a="http://schemas.openxmlformats.org/drawingml/2006/main">
+              <a:graphicData uri="http://schemas.openxmlformats.org/drawingml/2006/picture">
+                <pic:pic xmlns:pic="http://schemas.openxmlformats.org/drawingml/2006/picture">
+                  <pic:nvPicPr>
+                    <pic:cNvPr id="50673541" name="Imagem 50673541"/>
+                    <pic:cNvPicPr/>
+                  </pic:nvPicPr>
+                  <pic:blipFill>
+                    <a:blip r:embed="rId12"/>
+                    <a:stretch>
+                      <a:fillRect/>
+                    </a:stretch>
+                  </pic:blipFill>
+                  <pic:spPr>
+                    <a:xfrm>
+                      <a:off x="0" y="0"/>
+                      <a:ext cx="5486400" cy="3086100"/>
+                    </a:xfrm>
+                    <a:prstGeom prst="rect">
+                      <a:avLst/>
+                    </a:prstGeom>
+                  </pic:spPr>
+                </pic:pic>
+              </a:graphicData>
+            </a:graphic>
+          </wp:inline>
+        </w:drawing>
+      </w:r>
+    </w:p>
+    <w:p>
+      <w:pPr>
+        <w:rPr>
           <w:u w:val="single"/>
           <w:lang w:val="pt-BR"/>
         </w:rPr>
@@ -507,14 +1037,7 @@
         <w:rPr>
           <w:lang w:val="pt-BR"/>
         </w:rPr>
-        <w:t xml:space="preserve">Através de rotinas no código que acionam dicionários internos do Inep, respostas em códigos são traduzidas ativamente. Assim, indicadores como renda familiar, escolaridade dos pais e vinculação dos estudantes a políticas de acesso (como cotas e bolsas de pesquisa) </w:t>
-      </w:r>
-      <w:r>
-        <w:rPr>
-          <w:lang w:val="pt-BR"/>
-        </w:rPr>
-        <w:lastRenderedPageBreak/>
-        <w:t>são exibidos graficamente, elucidando a influência do capital sociocultural e das políticas de auxílio na adaptação e trajetória formativa</w:t>
+        <w:t>Através de rotinas no código que acionam dicionários internos do Inep, respostas em códigos são traduzidas ativamente. Assim, indicadores como renda familiar, escolaridade dos pais e vinculação dos estudantes a políticas de acesso (como cotas e bolsas de pesquisa) são exibidos graficamente, elucidando a influência do capital sociocultural e das políticas de auxílio na adaptação e trajetória formativa</w:t>
       </w:r>
       <w:r>
         <w:rPr>
@@ -558,9 +1081,120 @@
       </w:pPr>
       <w:r>
         <w:rPr>
-          <w:lang w:val="pt-BR"/>
-        </w:rPr>
-        <w:t>Na aba "Questionário do Estudante", as questões aplicadas na Escala Likert, que avaliam a organização didático-pedagógica e a infraestrutura, são dispostas com seus enunciados completos. O dashboard calcula a porcentagem exata de satisfação ou insatisfação dos estudantes, revelando condições cruciais de sucesso acadêmico.</w:t>
+          <w:noProof/>
+          <w:lang w:val="pt-BR"/>
+        </w:rPr>
+        <w:drawing>
+          <wp:inline distT="0" distB="0" distL="0" distR="0" wp14:anchorId="0546A146" wp14:editId="0C57FCD2">
+            <wp:extent cx="5486400" cy="1140460"/>
+            <wp:effectExtent l="0" t="0" r="0" b="2540"/>
+            <wp:docPr id="74680203" name="Imagem 11"/>
+            <wp:cNvGraphicFramePr>
+              <a:graphicFrameLocks xmlns:a="http://schemas.openxmlformats.org/drawingml/2006/main" noChangeAspect="1"/>
+            </wp:cNvGraphicFramePr>
+            <a:graphic xmlns:a="http://schemas.openxmlformats.org/drawingml/2006/main">
+              <a:graphicData uri="http://schemas.openxmlformats.org/drawingml/2006/picture">
+                <pic:pic xmlns:pic="http://schemas.openxmlformats.org/drawingml/2006/picture">
+                  <pic:nvPicPr>
+                    <pic:cNvPr id="74680203" name="Imagem 74680203"/>
+                    <pic:cNvPicPr/>
+                  </pic:nvPicPr>
+                  <pic:blipFill>
+                    <a:blip r:embed="rId13"/>
+                    <a:stretch>
+                      <a:fillRect/>
+                    </a:stretch>
+                  </pic:blipFill>
+                  <pic:spPr>
+                    <a:xfrm>
+                      <a:off x="0" y="0"/>
+                      <a:ext cx="5486400" cy="1140460"/>
+                    </a:xfrm>
+                    <a:prstGeom prst="rect">
+                      <a:avLst/>
+                    </a:prstGeom>
+                  </pic:spPr>
+                </pic:pic>
+              </a:graphicData>
+            </a:graphic>
+          </wp:inline>
+        </w:drawing>
+      </w:r>
+    </w:p>
+    <w:p>
+      <w:pPr>
+        <w:rPr>
+          <w:lang w:val="pt-BR"/>
+        </w:rPr>
+      </w:pPr>
+      <w:r>
+        <w:rPr>
+          <w:noProof/>
+          <w:lang w:val="pt-BR"/>
+        </w:rPr>
+        <w:lastRenderedPageBreak/>
+        <w:drawing>
+          <wp:inline distT="0" distB="0" distL="0" distR="0" wp14:anchorId="30F69FE7" wp14:editId="7A4ECA9E">
+            <wp:extent cx="5486400" cy="2733040"/>
+            <wp:effectExtent l="0" t="0" r="0" b="0"/>
+            <wp:docPr id="1931357280" name="Imagem 12"/>
+            <wp:cNvGraphicFramePr>
+              <a:graphicFrameLocks xmlns:a="http://schemas.openxmlformats.org/drawingml/2006/main" noChangeAspect="1"/>
+            </wp:cNvGraphicFramePr>
+            <a:graphic xmlns:a="http://schemas.openxmlformats.org/drawingml/2006/main">
+              <a:graphicData uri="http://schemas.openxmlformats.org/drawingml/2006/picture">
+                <pic:pic xmlns:pic="http://schemas.openxmlformats.org/drawingml/2006/picture">
+                  <pic:nvPicPr>
+                    <pic:cNvPr id="1931357280" name="Imagem 1931357280"/>
+                    <pic:cNvPicPr/>
+                  </pic:nvPicPr>
+                  <pic:blipFill>
+                    <a:blip r:embed="rId14"/>
+                    <a:stretch>
+                      <a:fillRect/>
+                    </a:stretch>
+                  </pic:blipFill>
+                  <pic:spPr>
+                    <a:xfrm>
+                      <a:off x="0" y="0"/>
+                      <a:ext cx="5486400" cy="2733040"/>
+                    </a:xfrm>
+                    <a:prstGeom prst="rect">
+                      <a:avLst/>
+                    </a:prstGeom>
+                  </pic:spPr>
+                </pic:pic>
+              </a:graphicData>
+            </a:graphic>
+          </wp:inline>
+        </w:drawing>
+      </w:r>
+    </w:p>
+    <w:p>
+      <w:pPr>
+        <w:rPr>
+          <w:lang w:val="pt-BR"/>
+        </w:rPr>
+      </w:pPr>
+      <w:r>
+        <w:rPr>
+          <w:lang w:val="pt-BR"/>
+        </w:rPr>
+        <w:t xml:space="preserve">Na aba "Questionário do Estudante", as questões aplicadas na Escala </w:t>
+      </w:r>
+      <w:proofErr w:type="spellStart"/>
+      <w:r>
+        <w:rPr>
+          <w:lang w:val="pt-BR"/>
+        </w:rPr>
+        <w:t>Likert</w:t>
+      </w:r>
+      <w:proofErr w:type="spellEnd"/>
+      <w:r>
+        <w:rPr>
+          <w:lang w:val="pt-BR"/>
+        </w:rPr>
+        <w:t>, que avaliam a organização didático-pedagógica e a infraestrutura, são dispostas com seus enunciados completos. O dashboard calcula a porcentagem exata de satisfação ou insatisfação dos estudantes, revelando condições cruciais de sucesso acadêmico.</w:t>
       </w:r>
     </w:p>
     <w:p>
@@ -600,7 +1234,21 @@
         <w:rPr>
           <w:lang w:val="pt-BR"/>
         </w:rPr>
-        <w:t>Por permitir a identificação instantânea de vulnerabilidades no aprendizado técnico (através da análise do Componente Específico) e levantar os pontos críticos relatados pela própria percepção do estudante, o dashboard cumpre sua premissa. Ele atua como um recurso de inteligência institucional, fornecendo os insumos baseados em dados (data-driven) necessários para o constante aperfeiçoamento da educação em engenharia no Brasil.</w:t>
+        <w:t>Por permitir a identificação instantânea de vulnerabilidades no aprendizado técnico (através da análise do Componente Específico) e levantar os pontos críticos relatados pela própria percepção do estudante, o dashboard cumpre sua premissa. Ele atua como um recurso de inteligência institucional, fornecendo os insumos baseados em dados (data-</w:t>
+      </w:r>
+      <w:proofErr w:type="spellStart"/>
+      <w:r>
+        <w:rPr>
+          <w:lang w:val="pt-BR"/>
+        </w:rPr>
+        <w:t>driven</w:t>
+      </w:r>
+      <w:proofErr w:type="spellEnd"/>
+      <w:r>
+        <w:rPr>
+          <w:lang w:val="pt-BR"/>
+        </w:rPr>
+        <w:t>) necessários para o constante aperfeiçoamento da educação em engenharia no Brasil.</w:t>
       </w:r>
     </w:p>
     <w:p>
@@ -625,6 +1273,7 @@
       </w:pPr>
       <w:r>
         <w:rPr>
+          <w:highlight w:val="green"/>
           <w:lang w:val="pt-BR"/>
         </w:rPr>
         <w:t>ALVES, R. M.; MATOS, A. M.; CANEDO, E. D. Plataforma de visualização dos dados minerados do ENADE dos cursos de Computação nos anos de 2008 a 2014. Singular. Engenharia, Tecnologia e Gestão, [S. l.], v. 1, n. 2, p. 11-18, 2019. Disponível em: https://doi.org/10.33911/singular-etg.v1i2.62. Acesso em: 16 maio 2026.</w:t>
@@ -638,9 +1287,34 @@
       </w:pPr>
       <w:r>
         <w:rPr>
-          <w:lang w:val="pt-BR"/>
-        </w:rPr>
-        <w:t>BARRETO, I. M. S.; FREITAS, A. E. S. Gerando inteligência através de microdados: uma proposta de business intelligence para a área de ensino do Instituto Federal da Bahia (IFBA). Cadernos de Educação, Tecnologia e Sociedade, [S. l.], v. 13, n. 4, p. 463-473, 2020. Disponível em: https://doi.org/10.14571/brajets.v13.n4.463-473. Acesso em: 16 maio 2026.</w:t>
+          <w:highlight w:val="green"/>
+          <w:lang w:val="pt-BR"/>
+        </w:rPr>
+        <w:t xml:space="preserve">BARRETO, I. M. S.; FREITAS, A. E. S. Gerando inteligência através de microdados: uma proposta de business </w:t>
+      </w:r>
+      <w:proofErr w:type="spellStart"/>
+      <w:r>
+        <w:rPr>
+          <w:highlight w:val="green"/>
+          <w:lang w:val="pt-BR"/>
+        </w:rPr>
+        <w:t>intelligence</w:t>
+      </w:r>
+      <w:proofErr w:type="spellEnd"/>
+      <w:r>
+        <w:rPr>
+          <w:highlight w:val="green"/>
+          <w:lang w:val="pt-BR"/>
+        </w:rPr>
+        <w:t xml:space="preserve"> para a área de ensino do Instituto Federal da Bahia </w:t>
+      </w:r>
+      <w:r>
+        <w:rPr>
+          <w:highlight w:val="green"/>
+          <w:lang w:val="pt-BR"/>
+        </w:rPr>
+        <w:lastRenderedPageBreak/>
+        <w:t>(IFBA). Cadernos de Educação, Tecnologia e Sociedade, [S. l.], v. 13, n. 4, p. 463-473, 2020. Disponível em: https://doi.org/10.14571/brajets.v13.n4.463-473. Acesso em: 16 maio 2026.</w:t>
       </w:r>
     </w:p>
     <w:p>
@@ -651,9 +1325,9 @@
       </w:pPr>
       <w:r>
         <w:rPr>
-          <w:lang w:val="pt-BR"/>
-        </w:rPr>
-        <w:lastRenderedPageBreak/>
+          <w:highlight w:val="yellow"/>
+          <w:lang w:val="pt-BR"/>
+        </w:rPr>
         <w:t>BRASIL. Instituto Nacional de Estudos e Pesquisas Educacionais Anísio Teixeira (Inep). Enade. Disponível em: https://www.gov.br/inep/pt-br/acesso-a-informacao/dados-abertos/microdados/enade. Acesso em: 16 maio 2026.</w:t>
       </w:r>
     </w:p>
@@ -691,6 +1365,7 @@
       </w:pPr>
       <w:r>
         <w:rPr>
+          <w:highlight w:val="yellow"/>
           <w:lang w:val="pt-BR"/>
         </w:rPr>
         <w:t>LIMA, B. A. T. Análise da percepção dos discentes sobre a formação na universidade por meio do questionário do estudante do ENADE. 2018. 45 f. Monografia (Graduação em Licenciatura em Química) – Centro de Ciências Agrárias, Universidade Federal da Paraíba, Areia, 2018. Disponível em: https://repositorio.ufpb.br/jspui/handle/123456789/15239. Acesso em: 16 maio 2026.</w:t>
@@ -704,9 +1379,26 @@
       </w:pPr>
       <w:r>
         <w:rPr>
-          <w:lang w:val="pt-BR"/>
-        </w:rPr>
-        <w:t>OTSUBO, A. M. Enade.Vis: uma ferramenta para visualização dos dados do Exame Nacional de Desempenho dos Estudantes (Enade). 2024. 47 f. Trabalho de Conclusão de Curso (Graduação em Ciência da Computação) – Universidade de Brasília, Brasília, 2024. Disponível em: https://bdm.unb.br/handle/10483/40759. Acesso em: 16 maio 2026.</w:t>
+          <w:highlight w:val="yellow"/>
+          <w:lang w:val="pt-BR"/>
+        </w:rPr>
+        <w:t xml:space="preserve">OTSUBO, A. M. </w:t>
+      </w:r>
+      <w:proofErr w:type="spellStart"/>
+      <w:r>
+        <w:rPr>
+          <w:highlight w:val="yellow"/>
+          <w:lang w:val="pt-BR"/>
+        </w:rPr>
+        <w:t>Enade.Vis</w:t>
+      </w:r>
+      <w:proofErr w:type="spellEnd"/>
+      <w:r>
+        <w:rPr>
+          <w:highlight w:val="yellow"/>
+          <w:lang w:val="pt-BR"/>
+        </w:rPr>
+        <w:t>: uma ferramenta para visualização dos dados do Exame Nacional de Desempenho dos Estudantes (Enade). 2024. 47 f. Trabalho de Conclusão de Curso (Graduação em Ciência da Computação) – Universidade de Brasília, Brasília, 2024. Disponível em: https://bdm.unb.br/handle/10483/40759. Acesso em: 16 maio 2026.</w:t>
       </w:r>
     </w:p>
     <w:p>
@@ -730,6 +1422,7 @@
       </w:pPr>
       <w:r>
         <w:rPr>
+          <w:highlight w:val="yellow"/>
           <w:lang w:val="pt-BR"/>
         </w:rPr>
         <w:t>SATHLER, L. H. Dashboard dos resultados do Ifes no Enade de Sistemas de Informação dos anos de 2017 e 2021. 2023. 69 f. Monografia (Graduação em Sistemas de Informação) – Instituto Federal do Espírito Santo, Serra, 2023. Disponível em: https://repositorio.ifes.edu.br/handle/123456789/4184. Acesso em: 16 maio 2026.</w:t>

</xml_diff>